<commit_message>
daten hinzugefügt für lländer
</commit_message>
<xml_diff>
--- a/assets/txt/Russland.docx
+++ b/assets/txt/Russland.docx
@@ -21,15 +21,27 @@
       <w:bookmarkEnd w:id="0"/>
       <w:r>
         <w:rPr>
+          <w:rtl w:val="0"/>
+        </w:rPr>
+      </w:r>
+    </w:p>
+    <w:p>
+      <w:pPr>
+        <w:pStyle w:val="Heading3"/>
+        <w:keepNext w:val="0"/>
+        <w:keepLines w:val="0"/>
+        <w:spacing w:before="280" w:lineRule="auto"/>
+        <w:rPr>
+          <w:rFonts w:ascii="Times New Roman" w:cs="Times New Roman" w:eastAsia="Times New Roman" w:hAnsi="Times New Roman"/>
           <w:b w:val="1"/>
           <w:bCs w:val="1"/>
           <w:color w:val="000000"/>
           <w:sz w:val="26"/>
           <w:szCs w:val="26"/>
-          <w:rtl w:val="0"/>
-        </w:rPr>
-        <w:t xml:space="preserve">🇷🇺 </w:t>
-      </w:r>
+        </w:rPr>
+      </w:pPr>
+      <w:bookmarkStart w:colFirst="0" w:colLast="0" w:name="_yvs7yris7opg" w:id="1"/>
+      <w:bookmarkEnd w:id="1"/>
       <w:r>
         <w:rPr>
           <w:rFonts w:ascii="Times New Roman" w:cs="Times New Roman" w:eastAsia="Times New Roman" w:hAnsi="Times New Roman"/>
@@ -40,7 +52,7 @@
           <w:szCs w:val="26"/>
           <w:rtl w:val="0"/>
         </w:rPr>
-        <w:t xml:space="preserve">Russland</w:t>
+        <w:t xml:space="preserve">🇷🇺 Russland</w:t>
       </w:r>
     </w:p>
     <w:p>
@@ -48,33 +60,16 @@
         <w:spacing w:after="240" w:before="240" w:lineRule="auto"/>
         <w:rPr>
           <w:rFonts w:ascii="Times New Roman" w:cs="Times New Roman" w:eastAsia="Times New Roman" w:hAnsi="Times New Roman"/>
-          <w:b w:val="1"/>
-          <w:bCs w:val="1"/>
-        </w:rPr>
-      </w:pPr>
-      <w:r>
-        <w:rPr>
-          <w:rFonts w:ascii="Times New Roman" w:cs="Times New Roman" w:eastAsia="Times New Roman" w:hAnsi="Times New Roman"/>
-          <w:b w:val="1"/>
-          <w:bCs w:val="1"/>
-          <w:rtl w:val="0"/>
-        </w:rPr>
-        <w:t xml:space="preserve">CO₂-Emissionen:</w:t>
+        </w:rPr>
+      </w:pPr>
+      <w:r>
+        <w:rPr>
+          <w:rFonts w:ascii="Times New Roman" w:cs="Times New Roman" w:eastAsia="Times New Roman" w:hAnsi="Times New Roman"/>
+          <w:rtl w:val="0"/>
+        </w:rPr>
+        <w:t xml:space="preserve">CO2 -Emissionen:</w:t>
         <w:br w:type="textWrapping"/>
-      </w:r>
-      <w:r>
-        <w:rPr>
-          <w:rFonts w:ascii="Times New Roman" w:cs="Times New Roman" w:eastAsia="Times New Roman" w:hAnsi="Times New Roman"/>
-          <w:rtl w:val="0"/>
-        </w:rPr>
-        <w:t xml:space="preserve"> Russland gehört zu den größten CO₂-Emittenten der Welt. Die Emissionen entstehen vor allem durch die Förderung und Nutzung von Erdöl, Erdgas und Kohle.</w:t>
-        <w:br w:type="textWrapping"/>
-        <w:t xml:space="preserve"> </w:t>
-      </w:r>
-      <w:r>
-        <w:rPr>
-          <w:rtl w:val="0"/>
-        </w:rPr>
+        <w:t xml:space="preserve"> Russland gehört weiterhin zu den größten CO2-Emittenten der Welt. Die Emissionen lagen bei etwa 1,9 Milliarden Tonnen CO2 (2019) und bei rund 2,0 Milliarden Tonnen CO2 (2024). Die Emissionen pro Kopf stiegen von etwa 13,3 t auf 14,1 t CO2 </w:t>
       </w:r>
     </w:p>
     <w:p>
@@ -82,33 +77,16 @@
         <w:spacing w:after="240" w:before="240" w:lineRule="auto"/>
         <w:rPr>
           <w:rFonts w:ascii="Times New Roman" w:cs="Times New Roman" w:eastAsia="Times New Roman" w:hAnsi="Times New Roman"/>
-          <w:b w:val="1"/>
-          <w:bCs w:val="1"/>
-        </w:rPr>
-      </w:pPr>
-      <w:r>
-        <w:rPr>
-          <w:rFonts w:ascii="Times New Roman" w:cs="Times New Roman" w:eastAsia="Times New Roman" w:hAnsi="Times New Roman"/>
-          <w:b w:val="1"/>
-          <w:bCs w:val="1"/>
+        </w:rPr>
+      </w:pPr>
+      <w:r>
+        <w:rPr>
+          <w:rFonts w:ascii="Times New Roman" w:cs="Times New Roman" w:eastAsia="Times New Roman" w:hAnsi="Times New Roman"/>
           <w:rtl w:val="0"/>
         </w:rPr>
         <w:t xml:space="preserve">Temperatur:</w:t>
         <w:br w:type="textWrapping"/>
-      </w:r>
-      <w:r>
-        <w:rPr>
-          <w:rFonts w:ascii="Times New Roman" w:cs="Times New Roman" w:eastAsia="Times New Roman" w:hAnsi="Times New Roman"/>
-          <w:rtl w:val="0"/>
-        </w:rPr>
-        <w:t xml:space="preserve"> Russland erwärmt sich schneller als der globale Durchschnitt. Besonders in Sibirien steigen die Temperaturen stark an.</w:t>
-        <w:br w:type="textWrapping"/>
-        <w:t xml:space="preserve"> </w:t>
-      </w:r>
-      <w:r>
-        <w:rPr>
-          <w:rtl w:val="0"/>
-        </w:rPr>
+        <w:t xml:space="preserve"> Zwischen 2019 und 2025 stiegen die Temperaturen in Russland weiter an. Besonders stark betroffen sind Sibirien und die Arktis, wo sich das Klima deutlich schneller erwärmt als im globalen Durchschnitt.</w:t>
       </w:r>
     </w:p>
     <w:p>
@@ -116,33 +94,16 @@
         <w:spacing w:after="240" w:before="240" w:lineRule="auto"/>
         <w:rPr>
           <w:rFonts w:ascii="Times New Roman" w:cs="Times New Roman" w:eastAsia="Times New Roman" w:hAnsi="Times New Roman"/>
-          <w:b w:val="1"/>
-          <w:bCs w:val="1"/>
-        </w:rPr>
-      </w:pPr>
-      <w:r>
-        <w:rPr>
-          <w:rFonts w:ascii="Times New Roman" w:cs="Times New Roman" w:eastAsia="Times New Roman" w:hAnsi="Times New Roman"/>
-          <w:b w:val="1"/>
-          <w:bCs w:val="1"/>
+        </w:rPr>
+      </w:pPr>
+      <w:r>
+        <w:rPr>
+          <w:rFonts w:ascii="Times New Roman" w:cs="Times New Roman" w:eastAsia="Times New Roman" w:hAnsi="Times New Roman"/>
           <w:rtl w:val="0"/>
         </w:rPr>
         <w:t xml:space="preserve">Extremwetter:</w:t>
         <w:br w:type="textWrapping"/>
-      </w:r>
-      <w:r>
-        <w:rPr>
-          <w:rFonts w:ascii="Times New Roman" w:cs="Times New Roman" w:eastAsia="Times New Roman" w:hAnsi="Times New Roman"/>
-          <w:rtl w:val="0"/>
-        </w:rPr>
-        <w:t xml:space="preserve"> Durch den Klimawandel nehmen Hitzewellen, Waldbrände und das Auftauen des Permafrosts zu. Das verursacht Schäden an Infrastruktur und Natur.</w:t>
-        <w:br w:type="textWrapping"/>
-        <w:t xml:space="preserve"> </w:t>
-      </w:r>
-      <w:r>
-        <w:rPr>
-          <w:rtl w:val="0"/>
-        </w:rPr>
+        <w:t xml:space="preserve"> In den letzten Jahren kam es häufiger zu Waldbränden, Hitzewellen, Dürren und dem Auftauen des Permafrosts. Dadurch entstehen große Schäden an Natur, Infrastruktur und Siedlungen.</w:t>
       </w:r>
     </w:p>
     <w:p>
@@ -155,21 +116,37 @@
       <w:r>
         <w:rPr>
           <w:rFonts w:ascii="Times New Roman" w:cs="Times New Roman" w:eastAsia="Times New Roman" w:hAnsi="Times New Roman"/>
-          <w:b w:val="1"/>
-          <w:bCs w:val="1"/>
           <w:rtl w:val="0"/>
         </w:rPr>
         <w:t xml:space="preserve">Klimagerechtigkeit:</w:t>
         <w:br w:type="textWrapping"/>
-      </w:r>
-      <w:r>
-        <w:rPr>
-          <w:rFonts w:ascii="Times New Roman" w:cs="Times New Roman" w:eastAsia="Times New Roman" w:hAnsi="Times New Roman"/>
-          <w:rtl w:val="0"/>
-        </w:rPr>
-        <w:t xml:space="preserve"> Russland trägt mit seinen hohen CO₂-Emissionen erheblich zum Klimawandel bei. Gleichzeitig ist das Land selbst von den Folgen betroffen, insbesondere durch die schnelle Erwärmung im Norden.</w:t>
-        <w:br w:type="textWrapping"/>
-        <w:t xml:space="preserve"> </w:t>
+        <w:t xml:space="preserve"> Russland trägt mit seinen hohen CO2 -Emissionen erheblich zum Klimawandel bei. Gleichzeitig ist das Land selbst stark von den Folgen betroffen. Vor allem durch die schnelle Erwärmung im Norden und das Auftauen des Permafrosts.</w:t>
+      </w:r>
+    </w:p>
+    <w:p>
+      <w:pPr>
+        <w:spacing w:after="240" w:before="240" w:lineRule="auto"/>
+        <w:rPr>
+          <w:rFonts w:ascii="Times New Roman" w:cs="Times New Roman" w:eastAsia="Times New Roman" w:hAnsi="Times New Roman"/>
+        </w:rPr>
+      </w:pPr>
+      <w:r>
+        <w:rPr>
+          <w:rtl w:val="0"/>
+        </w:rPr>
+      </w:r>
+    </w:p>
+    <w:p>
+      <w:pPr>
+        <w:spacing w:after="240" w:before="240" w:lineRule="auto"/>
+        <w:rPr>
+          <w:rFonts w:ascii="Times New Roman" w:cs="Times New Roman" w:eastAsia="Times New Roman" w:hAnsi="Times New Roman"/>
+        </w:rPr>
+      </w:pPr>
+      <w:r>
+        <w:rPr>
+          <w:rtl w:val="0"/>
+        </w:rPr>
       </w:r>
     </w:p>
     <w:sectPr>

</xml_diff>